<commit_message>
Finalize submission package: prose pass, author metadata, synced word counts
- Remaining em-dash pairs in supplementary methods rewritten; 'Moreover'
  construction replaced with a direct bad-control statement (991 words)
- DOCX core properties set (author, title, subject); files regenerated
- comment/ manuscript and page word-count labels synced
</commit_message>
<xml_diff>
--- a/submission/01_Technical_Comment_Science.docx
+++ b/submission/01_Technical_Comment_Science.docx
@@ -270,7 +270,7 @@
         <w:t xml:space="preserve">Duration</w:t>
       </w:r>
       <w:r>
-        <w:t xml:space="preserve">, the logarithm of birdwatching hours per birder, a ratio that discards the explosive growth in total effort. Moreover,</w:t>
+        <w:t xml:space="preserve">, the logarithm of birdwatching hours per birder, a ratio that discards the explosive growth in total effort.</w:t>
       </w:r>
       <w:r>
         <w:t xml:space="preserve"> </w:t>
@@ -285,7 +285,7 @@
         <w:t xml:space="preserve"> </w:t>
       </w:r>
       <w:r>
-        <w:t xml:space="preserve">itself responds to PSI (β = −0.0177,</w:t>
+        <w:t xml:space="preserve">is itself a post-treatment variable, responding to PSI (β = −0.0177,</w:t>
       </w:r>
       <w:r>
         <w:t xml:space="preserve"> </w:t>
@@ -301,7 +301,7 @@
         <w:t xml:space="preserve"> </w:t>
       </w:r>
       <w:r>
-        <w:t xml:space="preserve">&lt; 10⁻⁴), making it a</w:t>
+        <w:t xml:space="preserve">&lt; 10⁻⁴); conditioning on it is a classic</w:t>
       </w:r>
       <w:r>
         <w:t xml:space="preserve"> </w:t>
@@ -313,7 +313,7 @@
         <w:t xml:space="preserve"> </w:t>
       </w:r>
       <w:r>
-        <w:t xml:space="preserve">that conditions on a post-treatment variable (</w:t>
+        <w:t xml:space="preserve">(</w:t>
       </w:r>
       <w:r>
         <w:rPr>

</xml_diff>

<commit_message>
Lead measurement critique with the state-vs-observation-process principle (TC at 1000 words); highlight block in report page
</commit_message>
<xml_diff>
--- a/submission/01_Technical_Comment_Science.docx
+++ b/submission/01_Technical_Comment_Science.docx
@@ -165,7 +165,7 @@
         <w:t xml:space="preserve">2</w:t>
       </w:r>
       <w:r>
-        <w:t xml:space="preserve">), has been widely reported as evidence that China’s solar expansion harms birds. Using the authors’ public replication package, we reproduce their preferred estimate exactly (β = −0.0125, clustered SE = 0.0037,</w:t>
+        <w:t xml:space="preserve">), has been widely reported as evidence that solar expansion harms birds. Using the authors’ public replication package, we reproduce their preferred estimate exactly (β = −0.0125, clustered SE = 0.0037,</w:t>
       </w:r>
       <w:r>
         <w:t xml:space="preserve"> </w:t>
@@ -200,7 +200,30 @@
         <w:t xml:space="preserve"> </w:t>
       </w:r>
       <w:r>
-        <w:t xml:space="preserve">The dependent variable is a Shannon index computed from unstructured birdwatching reports within each county-month. In the estimation sample, 38.8% of county-months derive from a single birdwatcher, and the median county is observed in 11 of 120 months (Fig. 1C). Observed richness and Shannon diversity are steep, saturating functions of the number of birdwatchers present (Fig. 1B): county-months with one birder average 15 species (H = 1.90), while those with &gt;100 birders average 142 species (H = 3.60). This pattern is a species-accumulation curve rather than a property of bird communities. The authors’ own supplementary results carry its signature: PSI associates with lower observed richness but higher evenness (their table S19), the mechanical signature of shorter species lists; in our reproduction, evenness declines monotonically with effort (0.84 at one birder; 0.73 above 100).</w:t>
+        <w:t xml:space="preserve">Citizen-science records reflect a state process (where species occur, in what numbers) filtered through an observation process (who looks, where, when): taxonomic, temporal, and spatial detection biases mean raw records cannot be read as true occupancy or abundance (</w:t>
+      </w:r>
+      <w:r>
+        <w:rPr>
+          <w:i/>
+          <w:iCs/>
+        </w:rPr>
+        <w:t xml:space="preserve">5</w:t>
+      </w:r>
+      <w:r>
+        <w:t xml:space="preserve">,</w:t>
+      </w:r>
+      <w:r>
+        <w:t xml:space="preserve"> </w:t>
+      </w:r>
+      <w:r>
+        <w:rPr>
+          <w:i/>
+          <w:iCs/>
+        </w:rPr>
+        <w:t xml:space="preserve">8</w:t>
+      </w:r>
+      <w:r>
+        <w:t xml:space="preserve">). The dependent variable here is a Shannon index computed from unstructured birdwatching reports within each county-month. In the estimation sample, 38.8% of county-months rest on a single birdwatcher and the median county is observed in 11 of 120 months (Fig. 1C). Observed richness and Shannon diversity are steep, saturating functions of the number of birdwatchers present (Fig. 1B): county-months with one birder average 15 species (H = 1.90), while those with &gt;100 birders average 142 species (H = 3.60). This is a species-accumulation curve, not a community property. The authors’ own supplementary results carry its signature: PSI associates with lower observed richness but higher evenness (their table S19), the mechanical signature of shorter species lists; in our reproduction, evenness declines monotonically with effort (0.84 at one birder; 0.73 above 100).</w:t>
       </w:r>
     </w:p>
     <w:p>
@@ -209,7 +232,7 @@
         <w:spacing w:lineRule="auto" w:line="360"/>
       </w:pPr>
       <w:r>
-        <w:t xml:space="preserve">The input data are also unvalidated. In record-level platform data held by our own project, every count equals one in 46.9% of 2014–2023 checklists, and in 43.7% of the platform’s raw 2024 provincial delivery, in which we verified the count field to be genuine per-species abundance. Both figures are consistent with the 40.5% reported platform-wide by the China Ornithological Society, which also documents impossible counts in the source data (</w:t>
+        <w:t xml:space="preserve">The input data are also unvalidated. In record-level platform data held by our own project, every count equals one in 46.9% of 2014–2023 checklists (43.7% in the platform’s raw 2024 delivery, whose count field we verified as genuine abundance), consistent with the 40.5% reported platform-wide by the China Ornithological Society, which also documents impossible counts (</w:t>
       </w:r>
       <w:r>
         <w:rPr>
@@ -229,7 +252,7 @@
         <w:t xml:space="preserve">Egretta garzetta</w:t>
       </w:r>
       <w:r>
-        <w:t xml:space="preserve">; the 32-bit integer maximum) collapses Shannon diversity for Xinhui County in March 2015 to 8 × 10⁻⁷, against 2.2–2.9 in adjacent months, and this value enters the regression as an observation of the dependent variable (Fig. 1D). Eighteen further county-months share this corruption signature (≥20 species, H &lt; 0.2). No data-quality screening is described in (</w:t>
+        <w:t xml:space="preserve">; the 32-bit integer maximum) collapses Shannon diversity for Xinhui County in March 2015 to 8 × 10⁻⁷, against 2.2–2.9 in adjacent months, and this value enters the regression as an observation of the dependent variable (Fig. 1D). Eighteen more county-months share this signature (≥20 species, H &lt; 0.2). No data-quality screening is described in (</w:t>
       </w:r>
       <w:r>
         <w:rPr>
@@ -417,7 +440,7 @@
         <w:spacing w:lineRule="auto" w:line="360"/>
       </w:pPr>
       <w:r>
-        <w:t xml:space="preserve">The remedy is standard in the citizen-science literature: model the observation process explicitly (</w:t>
+        <w:t xml:space="preserve">The remedy is standard: model the observation process explicitly (</w:t>
       </w:r>
       <w:r>
         <w:rPr>
@@ -495,7 +518,7 @@
         <w:t xml:space="preserve"> </w:t>
       </w:r>
       <w:r>
-        <w:t xml:space="preserve">The policy variable is equally problematic: 703 of 2,344 sample counties (43.9% of observations) never appear in the policy-text source, and their PSI is imputed as zero even though the source distinguishes true zeros. Restricting the panel to counties actually documented in the policy source yields β = −0.0027 (</w:t>
+        <w:t xml:space="preserve">The policy variable is equally problematic: 703 of 2,344 sample counties (43.9% of observations) never appear in the policy-text source, and their PSI is imputed as zero although the source distinguishes true zeros. Restricting to policy-documented counties yields β = −0.0027 (</w:t>
       </w:r>
       <w:r>
         <w:rPr>
@@ -559,7 +582,7 @@
         <w:t xml:space="preserve"> </w:t>
       </w:r>
       <w:r>
-        <w:t xml:space="preserve">Our reanalysis does not show that photovoltaic development is harmless; ground-mounted solar can displace habitat, and rigorous impact studies are needed. It shows that this dataset, under this design, cannot detect such an effect in either direction. The subgroup results (no significant effect in desert counties) are already being read as support for concentrating gigawatt-scale development in arid lands, yet deserts are precisely where citizen-science coverage is sparsest; absence of evidence is not evidence of absence. Birdwatching records can support diversity inference under explicit conditions: effort-standardized richness, a presence-based quantity, is defensible with coverage-based rarefaction, list-length corrections, or occupancy models (</w:t>
+        <w:t xml:space="preserve">Our reanalysis does not show that photovoltaic development is harmless; ground-mounted solar can displace habitat and warrants rigorous impact studies. It shows that this dataset, under this design, cannot detect such an effect in either direction. The subgroup results (no significant effect in desert counties) are already being read as support for concentrating gigawatt-scale development in arid lands, yet deserts are where citizen-science coverage is sparsest; absence of evidence is not evidence of absence. Birdwatching records can support diversity inference under explicit conditions: effort-standardized richness, a presence-based quantity, is defensible with coverage-based rarefaction, list-length corrections, or occupancy models (</w:t>
       </w:r>
       <w:r>
         <w:rPr>

</xml_diff>

<commit_message>
Journal-convention figures; drop informal citation; self-evident corruption claim
- Submission figures (Fig1, Fig2, FigS1, FigS2) regenerated without
  in-panel narrative titles; FigS2 fully English with direct labels;
  panel-B share aligned to 38.8%; Fig1D annotation now states the
  arithmetically self-evident corruption (H = 8e-7 with S = 4)
- WeChat-statement reference removed; references renumbered (10);
  input paragraph rests entirely on first-hand record-level data and
  arithmetic implication of the published values; 992 words
- Titled Chinese figure versions retained for the web page
</commit_message>
<xml_diff>
--- a/submission/01_Technical_Comment_Science.docx
+++ b/submission/01_Technical_Comment_Science.docx
@@ -207,7 +207,7 @@
           <w:i/>
           <w:iCs/>
         </w:rPr>
-        <w:t xml:space="preserve">5</w:t>
+        <w:t xml:space="preserve">4</w:t>
       </w:r>
       <w:r>
         <w:t xml:space="preserve">,</w:t>
@@ -220,10 +220,321 @@
           <w:i/>
           <w:iCs/>
         </w:rPr>
+        <w:t xml:space="preserve">7</w:t>
+      </w:r>
+      <w:r>
+        <w:t xml:space="preserve">). The dependent variable here is a Shannon index computed from unstructured birdwatching reports within each county-month. In the estimation sample, 38.8% of county-months rest on a single birdwatcher and the median county is observed in 11 of 120 months (Fig. 1C). Observed richness and Shannon diversity are steep, saturating functions of the number of birdwatchers present (Fig. 1B): county-months with one birder average 15 species (H = 1.90), while those with &gt;100 birders average 142 species (H = 3.60). This is a species-accumulation curve, not a community property. The authors’ own supplementary results carry its signature: PSI associates with lower observed richness but higher evenness (their table S19), the mechanical signature of shorter species lists; in our reproduction, evenness declines monotonically with effort (0.84 at one birder; 0.73 above 100).</w:t>
+      </w:r>
+    </w:p>
+    <w:p>
+      <w:pPr>
+        <w:pStyle w:val="BodyText"/>
+        <w:spacing w:lineRule="auto" w:line="360"/>
+      </w:pPr>
+      <w:r>
+        <w:t xml:space="preserve">The input data are also unvalidated. In record-level platform data held by our own project, every count equals one in 46.9% of 2014–2023 checklists (43.7% in the platform’s raw 2024 delivery, whose count field we verified as genuine abundance); such records carry no usable abundance information and cannot support abundance-weighted indices. Corrupted counts also reach the published analysis directly: the Shannon value for Xinhui County in March 2015 is 8 × 10⁻⁷ with four species recorded, against 2.2–2.9 in adjacent months; arithmetically, such a value requires a single species count of at least tens of millions. This entry enters the regression as an observation of the dependent variable (Fig. 1D). Eighteen more county-months share this signature (≥20 species, H &lt; 0.2). No data-quality screening is described in (</w:t>
+      </w:r>
+      <w:r>
+        <w:rPr>
+          <w:i/>
+          <w:iCs/>
+        </w:rPr>
+        <w:t xml:space="preserve">1</w:t>
+      </w:r>
+      <w:r>
+        <w:t xml:space="preserve">).</w:t>
+      </w:r>
+    </w:p>
+    <w:p>
+      <w:pPr>
+        <w:pStyle w:val="BodyText"/>
+        <w:spacing w:lineRule="auto" w:line="360"/>
+      </w:pPr>
+      <w:r>
+        <w:rPr>
+          <w:b/>
+          <w:bCs/>
+        </w:rPr>
+        <w:t xml:space="preserve">Birdwatching effort is confounded with the treatment.</w:t>
+      </w:r>
+      <w:r>
+        <w:t xml:space="preserve"> </w:t>
+      </w:r>
+      <w:r>
+        <w:t xml:space="preserve">Summed birdwatcher counts grew 171-fold over 2014–2023 and observed county-months 25-fold, precisely as mean PSI quadrupled (Fig. 1A). The authors control only for</w:t>
+      </w:r>
+      <w:r>
+        <w:t xml:space="preserve"> </w:t>
+      </w:r>
+      <w:r>
+        <w:rPr>
+          <w:rStyle w:val="VerbatimChar"/>
+        </w:rPr>
+        <w:t xml:space="preserve">Duration</w:t>
+      </w:r>
+      <w:r>
+        <w:t xml:space="preserve">, the logarithm of birdwatching hours per birder, a ratio that discards the explosive growth in total effort.</w:t>
+      </w:r>
+      <w:r>
+        <w:t xml:space="preserve"> </w:t>
+      </w:r>
+      <w:r>
+        <w:rPr>
+          <w:rStyle w:val="VerbatimChar"/>
+        </w:rPr>
+        <w:t xml:space="preserve">Duration</w:t>
+      </w:r>
+      <w:r>
+        <w:t xml:space="preserve"> </w:t>
+      </w:r>
+      <w:r>
+        <w:t xml:space="preserve">is itself a post-treatment variable, responding to PSI (β = −0.0177,</w:t>
+      </w:r>
+      <w:r>
+        <w:t xml:space="preserve"> </w:t>
+      </w:r>
+      <w:r>
+        <w:rPr>
+          <w:i/>
+          <w:iCs/>
+        </w:rPr>
+        <w:t xml:space="preserve">P</w:t>
+      </w:r>
+      <w:r>
+        <w:t xml:space="preserve"> </w:t>
+      </w:r>
+      <w:r>
+        <w:t xml:space="preserve">&lt; 10⁻⁴); conditioning on it is a classic</w:t>
+      </w:r>
+      <w:r>
+        <w:t xml:space="preserve"> </w:t>
+      </w:r>
+      <w:r>
+        <w:t xml:space="preserve">“bad control”</w:t>
+      </w:r>
+      <w:r>
+        <w:t xml:space="preserve"> </w:t>
+      </w:r>
+      <w:r>
+        <w:t xml:space="preserve">(</w:t>
+      </w:r>
+      <w:r>
+        <w:rPr>
+          <w:i/>
+          <w:iCs/>
+        </w:rPr>
+        <w:t xml:space="preserve">3</w:t>
+      </w:r>
+      <w:r>
+        <w:t xml:space="preserve">). Birdwatcher numbers serve as a negative-control outcome: PSI</w:t>
+      </w:r>
+      <w:r>
+        <w:t xml:space="preserve"> </w:t>
+      </w:r>
+      <w:r>
+        <w:t xml:space="preserve">“reduces”</w:t>
+      </w:r>
+      <w:r>
+        <w:t xml:space="preserve"> </w:t>
+      </w:r>
+      <w:r>
+        <w:t xml:space="preserve">birdwatchers (β = −0.041,</w:t>
+      </w:r>
+      <w:r>
+        <w:t xml:space="preserve"> </w:t>
+      </w:r>
+      <w:r>
+        <w:rPr>
+          <w:i/>
+          <w:iCs/>
+        </w:rPr>
+        <w:t xml:space="preserve">P</w:t>
+      </w:r>
+      <w:r>
+        <w:t xml:space="preserve"> </w:t>
+      </w:r>
+      <w:r>
+        <w:t xml:space="preserve">= 2 × 10⁻¹¹), an association unlikely to reflect birdwatcher behaviour. The association shrinks by 81% within policy-documented counties (β = −0.008,</w:t>
+      </w:r>
+      <w:r>
+        <w:t xml:space="preserve"> </w:t>
+      </w:r>
+      <w:r>
+        <w:rPr>
+          <w:i/>
+          <w:iCs/>
+        </w:rPr>
+        <w:t xml:space="preserve">P</w:t>
+      </w:r>
+      <w:r>
+        <w:t xml:space="preserve"> </w:t>
+      </w:r>
+      <w:r>
+        <w:t xml:space="preserve">= 0.17); next-year PSI</w:t>
+      </w:r>
+      <w:r>
+        <w:t xml:space="preserve"> </w:t>
+      </w:r>
+      <w:r>
+        <w:t xml:space="preserve">“affects”</w:t>
+      </w:r>
+      <w:r>
+        <w:t xml:space="preserve"> </w:t>
+      </w:r>
+      <w:r>
+        <w:t xml:space="preserve">current birdwatchers conditional on current PSI (β = −0.045,</w:t>
+      </w:r>
+      <w:r>
+        <w:t xml:space="preserve"> </w:t>
+      </w:r>
+      <w:r>
+        <w:rPr>
+          <w:i/>
+          <w:iCs/>
+        </w:rPr>
+        <w:t xml:space="preserve">P</w:t>
+      </w:r>
+      <w:r>
+        <w:t xml:space="preserve"> </w:t>
+      </w:r>
+      <w:r>
+        <w:t xml:space="preserve">&lt; 10⁻⁵), a causally impossible direction that indicates differential county trends; and PSI does not predict realized PV area within counties (</w:t>
+      </w:r>
+      <w:r>
+        <w:rPr>
+          <w:i/>
+          <w:iCs/>
+        </w:rPr>
+        <w:t xml:space="preserve">P</w:t>
+      </w:r>
+      <w:r>
+        <w:t xml:space="preserve"> </w:t>
+      </w:r>
+      <w:r>
+        <w:t xml:space="preserve">= 0.27), which weakens any construction-disturbance pathway. A design in which future policy shifts a non-ecological outcome can generate spurious effects for any outcome, including birds.</w:t>
+      </w:r>
+    </w:p>
+    <w:p>
+      <w:pPr>
+        <w:pStyle w:val="BodyText"/>
+        <w:spacing w:lineRule="auto" w:line="360"/>
+      </w:pPr>
+      <w:r>
+        <w:t xml:space="preserve">The remedy is standard: model the observation process explicitly (</w:t>
+      </w:r>
+      <w:r>
+        <w:rPr>
+          <w:i/>
+          <w:iCs/>
+        </w:rPr>
+        <w:t xml:space="preserve">4</w:t>
+      </w:r>
+      <w:r>
+        <w:t xml:space="preserve">–</w:t>
+      </w:r>
+      <w:r>
+        <w:rPr>
+          <w:i/>
+          <w:iCs/>
+        </w:rPr>
+        <w:t xml:space="preserve">7</w:t>
+      </w:r>
+      <w:r>
+        <w:t xml:space="preserve">). Within the authors’ own specification (same data, fixed effects, and clustering), adding ln(birdwatchers) flips the PSI coefficient to +0.0032 (</w:t>
+      </w:r>
+      <w:r>
+        <w:rPr>
+          <w:i/>
+          <w:iCs/>
+        </w:rPr>
+        <w:t xml:space="preserve">P</w:t>
+      </w:r>
+      <w:r>
+        <w:t xml:space="preserve"> </w:t>
+      </w:r>
+      <w:r>
+        <w:t xml:space="preserve">= 0.31); adding ln(total hours) or both terms gives the same null (Fig. 2A). The richness decline of −0.98 species per PSI unit (their table S19) shrinks by 92% to −0.07 (</w:t>
+      </w:r>
+      <w:r>
+        <w:rPr>
+          <w:i/>
+          <w:iCs/>
+        </w:rPr>
+        <w:t xml:space="preserve">P</w:t>
+      </w:r>
+      <w:r>
+        <w:t xml:space="preserve"> </w:t>
+      </w:r>
+      <w:r>
+        <w:t xml:space="preserve">= 0.37), and the corrected effect within the 2020–2023 boom is +0.0002 (</w:t>
+      </w:r>
+      <w:r>
+        <w:rPr>
+          <w:i/>
+          <w:iCs/>
+        </w:rPr>
+        <w:t xml:space="preserve">P</w:t>
+      </w:r>
+      <w:r>
+        <w:t xml:space="preserve"> </w:t>
+      </w:r>
+      <w:r>
+        <w:t xml:space="preserve">= 0.96).</w:t>
+      </w:r>
+    </w:p>
+    <w:p>
+      <w:pPr>
+        <w:pStyle w:val="BodyText"/>
+        <w:spacing w:lineRule="auto" w:line="360"/>
+      </w:pPr>
+      <w:r>
+        <w:rPr>
+          <w:b/>
+          <w:bCs/>
+        </w:rPr>
+        <w:t xml:space="preserve">The estimate is fragile and, at face value, negligible.</w:t>
+      </w:r>
+      <w:r>
+        <w:t xml:space="preserve"> </w:t>
+      </w:r>
+      <w:r>
+        <w:t xml:space="preserve">The policy variable is equally problematic: 703 of 2,344 sample counties (43.9% of observations) never appear in the policy-text source, and their PSI is imputed as zero although the source distinguishes true zeros. Restricting to policy-documented counties yields β = −0.0027 (</w:t>
+      </w:r>
+      <w:r>
+        <w:rPr>
+          <w:i/>
+          <w:iCs/>
+        </w:rPr>
+        <w:t xml:space="preserve">P</w:t>
+      </w:r>
+      <w:r>
+        <w:t xml:space="preserve"> </w:t>
+      </w:r>
+      <w:r>
+        <w:t xml:space="preserve">= 0.49). Even taken at face value, PSI adds 0.0003 to the model’s R², or 0.03% of the variance in Shannon diversity, against 31% absorbed by fixed effects (Fig. 2B); the implied one-standard-deviation shift (0.052 on H) is 6.5% of the residual standard deviation (0.80). A statistically significant coefficient of this size, estimated from a contaminated, effort-driven outcome, carries little ecological information (</w:t>
+      </w:r>
+      <w:r>
+        <w:rPr>
+          <w:i/>
+          <w:iCs/>
+        </w:rPr>
         <w:t xml:space="preserve">8</w:t>
       </w:r>
       <w:r>
-        <w:t xml:space="preserve">). The dependent variable here is a Shannon index computed from unstructured birdwatching reports within each county-month. In the estimation sample, 38.8% of county-months rest on a single birdwatcher and the median county is observed in 11 of 120 months (Fig. 1C). Observed richness and Shannon diversity are steep, saturating functions of the number of birdwatchers present (Fig. 1B): county-months with one birder average 15 species (H = 1.90), while those with &gt;100 birders average 142 species (H = 3.60). This is a species-accumulation curve, not a community property. The authors’ own supplementary results carry its signature: PSI associates with lower observed richness but higher evenness (their table S19), the mechanical signature of shorter species lists; in our reproduction, evenness declines monotonically with effort (0.84 at one birder; 0.73 above 100).</w:t>
+        <w:t xml:space="preserve">,</w:t>
+      </w:r>
+      <w:r>
+        <w:t xml:space="preserve"> </w:t>
+      </w:r>
+      <w:r>
+        <w:rPr>
+          <w:i/>
+          <w:iCs/>
+        </w:rPr>
+        <w:t xml:space="preserve">9</w:t>
+      </w:r>
+      <w:r>
+        <w:t xml:space="preserve">).</w:t>
       </w:r>
     </w:p>
     <w:p>
@@ -232,37 +543,7 @@
         <w:spacing w:lineRule="auto" w:line="360"/>
       </w:pPr>
       <w:r>
-        <w:t xml:space="preserve">The input data are also unvalidated. In record-level platform data held by our own project, every count equals one in 46.9% of 2014–2023 checklists (43.7% in the platform’s raw 2024 delivery, whose count field we verified as genuine abundance), consistent with the 40.5% reported platform-wide by the China Ornithological Society, which also documents impossible counts (</w:t>
-      </w:r>
-      <w:r>
-        <w:rPr>
-          <w:i/>
-          <w:iCs/>
-        </w:rPr>
-        <w:t xml:space="preserve">3</w:t>
-      </w:r>
-      <w:r>
-        <w:t xml:space="preserve">). Such records cannot support abundance-weighted indices. At least one such record demonstrably contaminates the published analysis: a single report of 2,147,483,647 little egrets (</w:t>
-      </w:r>
-      <w:r>
-        <w:rPr>
-          <w:i/>
-          <w:iCs/>
-        </w:rPr>
-        <w:t xml:space="preserve">Egretta garzetta</w:t>
-      </w:r>
-      <w:r>
-        <w:t xml:space="preserve">; the 32-bit integer maximum) collapses Shannon diversity for Xinhui County in March 2015 to 8 × 10⁻⁷, against 2.2–2.9 in adjacent months, and this value enters the regression as an observation of the dependent variable (Fig. 1D). Eighteen more county-months share this signature (≥20 species, H &lt; 0.2). No data-quality screening is described in (</w:t>
-      </w:r>
-      <w:r>
-        <w:rPr>
-          <w:i/>
-          <w:iCs/>
-        </w:rPr>
-        <w:t xml:space="preserve">1</w:t>
-      </w:r>
-      <w:r>
-        <w:t xml:space="preserve">).</w:t>
+        <w:t xml:space="preserve">To establish what the data do support, we estimated all 36 combinations of sample (full or policy-documented), cleaning (as published, corrupted rows removed, or ≥2 birders), metric (Shannon, Simpson, log richness), and effort adjustment (fig. S1). All seven significant negative estimates come from paths without effort terms; all 18 effort-adjusted paths are null (median +0.10%). Our preferred estimate (corrupted records removed, policy-documented counties, explicit effort terms) is +0.14% for Shannon diversity (95% CI, −0.96 to +1.24%), an interval that excludes the published −2.10%. Had that effect been real, this corrected design would have detected it with 96% power.</w:t>
       </w:r>
     </w:p>
     <w:p>
@@ -275,68 +556,13 @@
           <w:b/>
           <w:bCs/>
         </w:rPr>
-        <w:t xml:space="preserve">Birdwatching effort is confounded with the treatment.</w:t>
-      </w:r>
-      <w:r>
-        <w:t xml:space="preserve"> </w:t>
-      </w:r>
-      <w:r>
-        <w:t xml:space="preserve">Summed birdwatcher counts grew 171-fold over 2014–2023 and observed county-months 25-fold, precisely as mean PSI quadrupled (Fig. 1A). The authors control only for</w:t>
-      </w:r>
-      <w:r>
-        <w:t xml:space="preserve"> </w:t>
-      </w:r>
-      <w:r>
-        <w:rPr>
-          <w:rStyle w:val="VerbatimChar"/>
-        </w:rPr>
-        <w:t xml:space="preserve">Duration</w:t>
-      </w:r>
-      <w:r>
-        <w:t xml:space="preserve">, the logarithm of birdwatching hours per birder, a ratio that discards the explosive growth in total effort.</w:t>
-      </w:r>
-      <w:r>
-        <w:t xml:space="preserve"> </w:t>
-      </w:r>
-      <w:r>
-        <w:rPr>
-          <w:rStyle w:val="VerbatimChar"/>
-        </w:rPr>
-        <w:t xml:space="preserve">Duration</w:t>
-      </w:r>
-      <w:r>
-        <w:t xml:space="preserve"> </w:t>
-      </w:r>
-      <w:r>
-        <w:t xml:space="preserve">is itself a post-treatment variable, responding to PSI (β = −0.0177,</w:t>
-      </w:r>
-      <w:r>
-        <w:t xml:space="preserve"> </w:t>
-      </w:r>
-      <w:r>
-        <w:rPr>
-          <w:i/>
-          <w:iCs/>
-        </w:rPr>
-        <w:t xml:space="preserve">P</w:t>
-      </w:r>
-      <w:r>
-        <w:t xml:space="preserve"> </w:t>
-      </w:r>
-      <w:r>
-        <w:t xml:space="preserve">&lt; 10⁻⁴); conditioning on it is a classic</w:t>
-      </w:r>
-      <w:r>
-        <w:t xml:space="preserve"> </w:t>
-      </w:r>
-      <w:r>
-        <w:t xml:space="preserve">“bad control”</w:t>
-      </w:r>
-      <w:r>
-        <w:t xml:space="preserve"> </w:t>
-      </w:r>
-      <w:r>
-        <w:t xml:space="preserve">(</w:t>
+        <w:t xml:space="preserve">Implications.</w:t>
+      </w:r>
+      <w:r>
+        <w:t xml:space="preserve"> </w:t>
+      </w:r>
+      <w:r>
+        <w:t xml:space="preserve">Our reanalysis does not show that photovoltaic development is harmless; ground-mounted solar can displace habitat and warrants rigorous impact studies. It shows that this dataset, under this design, cannot detect such an effect in either direction. The subgroup results (no significant effect in desert counties) are already being read as support for concentrating gigawatt-scale development in arid lands, yet deserts are where citizen-science coverage is sparsest; absence of evidence is not evidence of absence. Birdwatching records can support diversity inference under explicit conditions: effort-standardized richness, a presence-based quantity, is defensible with coverage-based rarefaction, list-length corrections, or occupancy models (</w:t>
       </w:r>
       <w:r>
         <w:rPr>
@@ -346,110 +572,6 @@
         <w:t xml:space="preserve">4</w:t>
       </w:r>
       <w:r>
-        <w:t xml:space="preserve">). Birdwatcher numbers serve as a negative-control outcome: PSI</w:t>
-      </w:r>
-      <w:r>
-        <w:t xml:space="preserve"> </w:t>
-      </w:r>
-      <w:r>
-        <w:t xml:space="preserve">“reduces”</w:t>
-      </w:r>
-      <w:r>
-        <w:t xml:space="preserve"> </w:t>
-      </w:r>
-      <w:r>
-        <w:t xml:space="preserve">birdwatchers (β = −0.041,</w:t>
-      </w:r>
-      <w:r>
-        <w:t xml:space="preserve"> </w:t>
-      </w:r>
-      <w:r>
-        <w:rPr>
-          <w:i/>
-          <w:iCs/>
-        </w:rPr>
-        <w:t xml:space="preserve">P</w:t>
-      </w:r>
-      <w:r>
-        <w:t xml:space="preserve"> </w:t>
-      </w:r>
-      <w:r>
-        <w:t xml:space="preserve">= 2 × 10⁻¹¹), an association unlikely to reflect birdwatcher behaviour. The association shrinks by 81% within policy-documented counties (β = −0.008,</w:t>
-      </w:r>
-      <w:r>
-        <w:t xml:space="preserve"> </w:t>
-      </w:r>
-      <w:r>
-        <w:rPr>
-          <w:i/>
-          <w:iCs/>
-        </w:rPr>
-        <w:t xml:space="preserve">P</w:t>
-      </w:r>
-      <w:r>
-        <w:t xml:space="preserve"> </w:t>
-      </w:r>
-      <w:r>
-        <w:t xml:space="preserve">= 0.17); next-year PSI</w:t>
-      </w:r>
-      <w:r>
-        <w:t xml:space="preserve"> </w:t>
-      </w:r>
-      <w:r>
-        <w:t xml:space="preserve">“affects”</w:t>
-      </w:r>
-      <w:r>
-        <w:t xml:space="preserve"> </w:t>
-      </w:r>
-      <w:r>
-        <w:t xml:space="preserve">current birdwatchers conditional on current PSI (β = −0.045,</w:t>
-      </w:r>
-      <w:r>
-        <w:t xml:space="preserve"> </w:t>
-      </w:r>
-      <w:r>
-        <w:rPr>
-          <w:i/>
-          <w:iCs/>
-        </w:rPr>
-        <w:t xml:space="preserve">P</w:t>
-      </w:r>
-      <w:r>
-        <w:t xml:space="preserve"> </w:t>
-      </w:r>
-      <w:r>
-        <w:t xml:space="preserve">&lt; 10⁻⁵), a causally impossible direction that indicates differential county trends; and PSI does not predict realized PV area within counties (</w:t>
-      </w:r>
-      <w:r>
-        <w:rPr>
-          <w:i/>
-          <w:iCs/>
-        </w:rPr>
-        <w:t xml:space="preserve">P</w:t>
-      </w:r>
-      <w:r>
-        <w:t xml:space="preserve"> </w:t>
-      </w:r>
-      <w:r>
-        <w:t xml:space="preserve">= 0.27), which weakens any construction-disturbance pathway. A design in which future policy shifts a non-ecological outcome can generate spurious effects for any outcome, including birds.</w:t>
-      </w:r>
-    </w:p>
-    <w:p>
-      <w:pPr>
-        <w:pStyle w:val="BodyText"/>
-        <w:spacing w:lineRule="auto" w:line="360"/>
-      </w:pPr>
-      <w:r>
-        <w:t xml:space="preserve">The remedy is standard: model the observation process explicitly (</w:t>
-      </w:r>
-      <w:r>
-        <w:rPr>
-          <w:i/>
-          <w:iCs/>
-        </w:rPr>
-        <w:t xml:space="preserve">5</w:t>
-      </w:r>
-      <w:r>
         <w:t xml:space="preserve">–</w:t>
       </w:r>
       <w:r>
@@ -457,81 +579,13 @@
           <w:i/>
           <w:iCs/>
         </w:rPr>
-        <w:t xml:space="preserve">8</w:t>
-      </w:r>
-      <w:r>
-        <w:t xml:space="preserve">). Within the authors’ own specification (same data, fixed effects, and clustering), adding ln(birdwatchers) flips the PSI coefficient to +0.0032 (</w:t>
-      </w:r>
-      <w:r>
-        <w:rPr>
-          <w:i/>
-          <w:iCs/>
-        </w:rPr>
-        <w:t xml:space="preserve">P</w:t>
-      </w:r>
-      <w:r>
-        <w:t xml:space="preserve"> </w:t>
-      </w:r>
-      <w:r>
-        <w:t xml:space="preserve">= 0.31); adding ln(total hours) or both terms gives the same null (Fig. 2A). The richness decline of −0.98 species per PSI unit (their table S19) shrinks by 92% to −0.07 (</w:t>
-      </w:r>
-      <w:r>
-        <w:rPr>
-          <w:i/>
-          <w:iCs/>
-        </w:rPr>
-        <w:t xml:space="preserve">P</w:t>
-      </w:r>
-      <w:r>
-        <w:t xml:space="preserve"> </w:t>
-      </w:r>
-      <w:r>
-        <w:t xml:space="preserve">= 0.37), and the corrected effect within the 2020–2023 boom is +0.0002 (</w:t>
-      </w:r>
-      <w:r>
-        <w:rPr>
-          <w:i/>
-          <w:iCs/>
-        </w:rPr>
-        <w:t xml:space="preserve">P</w:t>
-      </w:r>
-      <w:r>
-        <w:t xml:space="preserve"> </w:t>
-      </w:r>
-      <w:r>
-        <w:t xml:space="preserve">= 0.96).</w:t>
-      </w:r>
-    </w:p>
-    <w:p>
-      <w:pPr>
-        <w:pStyle w:val="BodyText"/>
-        <w:spacing w:lineRule="auto" w:line="360"/>
-      </w:pPr>
-      <w:r>
-        <w:rPr>
-          <w:b/>
-          <w:bCs/>
-        </w:rPr>
-        <w:t xml:space="preserve">The estimate is fragile and, at face value, negligible.</w:t>
-      </w:r>
-      <w:r>
-        <w:t xml:space="preserve"> </w:t>
-      </w:r>
-      <w:r>
-        <w:t xml:space="preserve">The policy variable is equally problematic: 703 of 2,344 sample counties (43.9% of observations) never appear in the policy-text source, and their PSI is imputed as zero although the source distinguishes true zeros. Restricting to policy-documented counties yields β = −0.0027 (</w:t>
-      </w:r>
-      <w:r>
-        <w:rPr>
-          <w:i/>
-          <w:iCs/>
-        </w:rPr>
-        <w:t xml:space="preserve">P</w:t>
-      </w:r>
-      <w:r>
-        <w:t xml:space="preserve"> </w:t>
-      </w:r>
-      <w:r>
-        <w:t xml:space="preserve">= 0.49). Even taken at face value, PSI adds 0.0003 to the model’s R², or 0.03% of the variance in Shannon diversity, against 31% absorbed by fixed effects (Fig. 2B); the implied one-standard-deviation shift (0.052 on H) is 6.5% of the residual standard deviation (0.80). A statistically significant coefficient of this size, estimated from a contaminated, effort-driven outcome, carries little ecological information (</w:t>
+        <w:t xml:space="preserve">7</w:t>
+      </w:r>
+      <w:r>
+        <w:t xml:space="preserve">,</w:t>
+      </w:r>
+      <w:r>
+        <w:t xml:space="preserve"> </w:t>
       </w:r>
       <w:r>
         <w:rPr>
@@ -552,80 +606,6 @@
           <w:iCs/>
         </w:rPr>
         <w:t xml:space="preserve">10</w:t>
-      </w:r>
-      <w:r>
-        <w:t xml:space="preserve">).</w:t>
-      </w:r>
-    </w:p>
-    <w:p>
-      <w:pPr>
-        <w:pStyle w:val="BodyText"/>
-        <w:spacing w:lineRule="auto" w:line="360"/>
-      </w:pPr>
-      <w:r>
-        <w:t xml:space="preserve">To establish what the data do support, we estimated all 36 combinations of sample (full or policy-documented), cleaning (as published, corrupted rows removed, or ≥2 birders), metric (Shannon, Simpson, log richness), and effort adjustment (fig. S1). All seven significant negative estimates come from paths without effort terms; all 18 effort-adjusted paths are null (median +0.10%). Our preferred estimate (corrupted records removed, policy-documented counties, explicit effort terms) is +0.14% for Shannon diversity (95% CI, −0.96 to +1.24%), an interval that excludes the published −2.10%. Had that effect been real, this corrected design would have detected it with 96% power.</w:t>
-      </w:r>
-    </w:p>
-    <w:p>
-      <w:pPr>
-        <w:pStyle w:val="BodyText"/>
-        <w:spacing w:lineRule="auto" w:line="360"/>
-      </w:pPr>
-      <w:r>
-        <w:rPr>
-          <w:b/>
-          <w:bCs/>
-        </w:rPr>
-        <w:t xml:space="preserve">Implications.</w:t>
-      </w:r>
-      <w:r>
-        <w:t xml:space="preserve"> </w:t>
-      </w:r>
-      <w:r>
-        <w:t xml:space="preserve">Our reanalysis does not show that photovoltaic development is harmless; ground-mounted solar can displace habitat and warrants rigorous impact studies. It shows that this dataset, under this design, cannot detect such an effect in either direction. The subgroup results (no significant effect in desert counties) are already being read as support for concentrating gigawatt-scale development in arid lands, yet deserts are where citizen-science coverage is sparsest; absence of evidence is not evidence of absence. Birdwatching records can support diversity inference under explicit conditions: effort-standardized richness, a presence-based quantity, is defensible with coverage-based rarefaction, list-length corrections, or occupancy models (</w:t>
-      </w:r>
-      <w:r>
-        <w:rPr>
-          <w:i/>
-          <w:iCs/>
-        </w:rPr>
-        <w:t xml:space="preserve">5</w:t>
-      </w:r>
-      <w:r>
-        <w:t xml:space="preserve">–</w:t>
-      </w:r>
-      <w:r>
-        <w:rPr>
-          <w:i/>
-          <w:iCs/>
-        </w:rPr>
-        <w:t xml:space="preserve">8</w:t>
-      </w:r>
-      <w:r>
-        <w:t xml:space="preserve">,</w:t>
-      </w:r>
-      <w:r>
-        <w:t xml:space="preserve"> </w:t>
-      </w:r>
-      <w:r>
-        <w:rPr>
-          <w:i/>
-          <w:iCs/>
-        </w:rPr>
-        <w:t xml:space="preserve">10</w:t>
-      </w:r>
-      <w:r>
-        <w:t xml:space="preserve">,</w:t>
-      </w:r>
-      <w:r>
-        <w:t xml:space="preserve"> </w:t>
-      </w:r>
-      <w:r>
-        <w:rPr>
-          <w:i/>
-          <w:iCs/>
-        </w:rPr>
-        <w:t xml:space="preserve">11</w:t>
       </w:r>
       <w:r>
         <w:t xml:space="preserve">), whereas abundance-weighted indices such as Shannon additionally require complete checklists, validated counts, and detection-heterogeneity corrections. None of these conditions is met here. We encourage the authors to release the species-level records underlying their indices.</w:t>
@@ -733,16 +713,30 @@
         <w:spacing w:lineRule="auto" w:line="360"/>
       </w:pPr>
       <w:r>
-        <w:t xml:space="preserve">China Ornithological Society </w:t>
-      </w:r>
-      <w:r>
-        <w:rPr>
-          <w:rFonts w:hint="eastAsia"/>
-        </w:rPr>
-        <w:t xml:space="preserve">(中国动物学会鸟类学分会),</w:t>
-      </w:r>
-      <w:r>
-        <w:t xml:space="preserve"> Using birdwatching data for biodiversity assessment requires attention to data characteristics and applicability (2026); https://mp.weixin.qq.com/s/cDlMUCQXkIHZZ_sBBRdDTw.</w:t>
+        <w:t xml:space="preserve">C. Cinelli, A. Forney, J. Pearl, A crash course in good and bad controls.</w:t>
+      </w:r>
+      <w:r>
+        <w:t xml:space="preserve"> </w:t>
+      </w:r>
+      <w:r>
+        <w:rPr>
+          <w:i/>
+          <w:iCs/>
+        </w:rPr>
+        <w:t xml:space="preserve">Sociol. Methods Res.</w:t>
+      </w:r>
+      <w:r>
+        <w:t xml:space="preserve"> </w:t>
+      </w:r>
+      <w:r>
+        <w:rPr>
+          <w:b/>
+          <w:bCs/>
+        </w:rPr>
+        <w:t xml:space="preserve">53</w:t>
+      </w:r>
+      <w:r>
+        <w:t xml:space="preserve">, 1071–1104 (2024).</w:t>
       </w:r>
     </w:p>
     <w:p>
@@ -755,30 +749,30 @@
         <w:spacing w:lineRule="auto" w:line="360"/>
       </w:pPr>
       <w:r>
-        <w:t xml:space="preserve">C. Cinelli, A. Forney, J. Pearl, A crash course in good and bad controls.</w:t>
-      </w:r>
-      <w:r>
-        <w:t xml:space="preserve"> </w:t>
-      </w:r>
-      <w:r>
-        <w:rPr>
-          <w:i/>
-          <w:iCs/>
-        </w:rPr>
-        <w:t xml:space="preserve">Sociol. Methods Res.</w:t>
-      </w:r>
-      <w:r>
-        <w:t xml:space="preserve"> </w:t>
-      </w:r>
-      <w:r>
-        <w:rPr>
-          <w:b/>
-          <w:bCs/>
-        </w:rPr>
-        <w:t xml:space="preserve">53</w:t>
-      </w:r>
-      <w:r>
-        <w:t xml:space="preserve">, 1071–1104 (2024).</w:t>
+        <w:t xml:space="preserve">A. Johnston, W. M. Hochachka, M. E. Strimas-Mackey, V. Ruiz Gutierrez, O. J. Robinson, E. T. Miller, T. Auer, S. T. Kelling, D. Fink, Analytical guidelines to increase the value of community science data.</w:t>
+      </w:r>
+      <w:r>
+        <w:t xml:space="preserve"> </w:t>
+      </w:r>
+      <w:r>
+        <w:rPr>
+          <w:i/>
+          <w:iCs/>
+        </w:rPr>
+        <w:t xml:space="preserve">Divers. Distrib.</w:t>
+      </w:r>
+      <w:r>
+        <w:t xml:space="preserve"> </w:t>
+      </w:r>
+      <w:r>
+        <w:rPr>
+          <w:b/>
+          <w:bCs/>
+        </w:rPr>
+        <w:t xml:space="preserve">27</w:t>
+      </w:r>
+      <w:r>
+        <w:t xml:space="preserve">, 1265–1277 (2021).</w:t>
       </w:r>
     </w:p>
     <w:p>
@@ -791,30 +785,30 @@
         <w:spacing w:lineRule="auto" w:line="360"/>
       </w:pPr>
       <w:r>
-        <w:t xml:space="preserve">A. Johnston, W. M. Hochachka, M. E. Strimas-Mackey, V. Ruiz Gutierrez, O. J. Robinson, E. T. Miller, T. Auer, S. T. Kelling, D. Fink, Analytical guidelines to increase the value of community science data.</w:t>
-      </w:r>
-      <w:r>
-        <w:t xml:space="preserve"> </w:t>
-      </w:r>
-      <w:r>
-        <w:rPr>
-          <w:i/>
-          <w:iCs/>
-        </w:rPr>
-        <w:t xml:space="preserve">Divers. Distrib.</w:t>
-      </w:r>
-      <w:r>
-        <w:t xml:space="preserve"> </w:t>
-      </w:r>
-      <w:r>
-        <w:rPr>
-          <w:b/>
-          <w:bCs/>
-        </w:rPr>
-        <w:t xml:space="preserve">27</w:t>
-      </w:r>
-      <w:r>
-        <w:t xml:space="preserve">, 1265–1277 (2021).</w:t>
+        <w:t xml:space="preserve">S. Kelling, A. Johnston, A. Bonn, D. Fink, V. Ruiz-Gutierrez, R. Bonney, M. Fernandez, W. M. Hochachka, R. Julliard, R. Kraemer, R. Guralnick, Using semistructured surveys to improve citizen science data for monitoring biodiversity.</w:t>
+      </w:r>
+      <w:r>
+        <w:t xml:space="preserve"> </w:t>
+      </w:r>
+      <w:r>
+        <w:rPr>
+          <w:i/>
+          <w:iCs/>
+        </w:rPr>
+        <w:t xml:space="preserve">BioScience</w:t>
+      </w:r>
+      <w:r>
+        <w:t xml:space="preserve"> </w:t>
+      </w:r>
+      <w:r>
+        <w:rPr>
+          <w:b/>
+          <w:bCs/>
+        </w:rPr>
+        <w:t xml:space="preserve">69</w:t>
+      </w:r>
+      <w:r>
+        <w:t xml:space="preserve">, 170–179 (2019).</w:t>
       </w:r>
     </w:p>
     <w:p>
@@ -827,30 +821,30 @@
         <w:spacing w:lineRule="auto" w:line="360"/>
       </w:pPr>
       <w:r>
-        <w:t xml:space="preserve">S. Kelling, A. Johnston, A. Bonn, D. Fink, V. Ruiz-Gutierrez, R. Bonney, M. Fernandez, W. M. Hochachka, R. Julliard, R. Kraemer, R. Guralnick, Using semistructured surveys to improve citizen science data for monitoring biodiversity.</w:t>
-      </w:r>
-      <w:r>
-        <w:t xml:space="preserve"> </w:t>
-      </w:r>
-      <w:r>
-        <w:rPr>
-          <w:i/>
-          <w:iCs/>
-        </w:rPr>
-        <w:t xml:space="preserve">BioScience</w:t>
-      </w:r>
-      <w:r>
-        <w:t xml:space="preserve"> </w:t>
-      </w:r>
-      <w:r>
-        <w:rPr>
-          <w:b/>
-          <w:bCs/>
-        </w:rPr>
-        <w:t xml:space="preserve">69</w:t>
-      </w:r>
-      <w:r>
-        <w:t xml:space="preserve">, 170–179 (2019).</w:t>
+        <w:t xml:space="preserve">N. J. B. Isaac, A. J. van Strien, T. A. August, M. P. de Zeeuw, D. B. Roy, Statistics for citizen science: extracting signals of change from noisy ecological data.</w:t>
+      </w:r>
+      <w:r>
+        <w:t xml:space="preserve"> </w:t>
+      </w:r>
+      <w:r>
+        <w:rPr>
+          <w:i/>
+          <w:iCs/>
+        </w:rPr>
+        <w:t xml:space="preserve">Methods Ecol. Evol.</w:t>
+      </w:r>
+      <w:r>
+        <w:t xml:space="preserve"> </w:t>
+      </w:r>
+      <w:r>
+        <w:rPr>
+          <w:b/>
+          <w:bCs/>
+        </w:rPr>
+        <w:t xml:space="preserve">5</w:t>
+      </w:r>
+      <w:r>
+        <w:t xml:space="preserve">, 1052–1060 (2014).</w:t>
       </w:r>
     </w:p>
     <w:p>
@@ -863,30 +857,30 @@
         <w:spacing w:lineRule="auto" w:line="360"/>
       </w:pPr>
       <w:r>
-        <w:t xml:space="preserve">N. J. B. Isaac, A. J. van Strien, T. A. August, M. P. de Zeeuw, D. B. Roy, Statistics for citizen science: extracting signals of change from noisy ecological data.</w:t>
-      </w:r>
-      <w:r>
-        <w:t xml:space="preserve"> </w:t>
-      </w:r>
-      <w:r>
-        <w:rPr>
-          <w:i/>
-          <w:iCs/>
-        </w:rPr>
-        <w:t xml:space="preserve">Methods Ecol. Evol.</w:t>
-      </w:r>
-      <w:r>
-        <w:t xml:space="preserve"> </w:t>
-      </w:r>
-      <w:r>
-        <w:rPr>
-          <w:b/>
-          <w:bCs/>
-        </w:rPr>
-        <w:t xml:space="preserve">5</w:t>
-      </w:r>
-      <w:r>
-        <w:t xml:space="preserve">, 1052–1060 (2014).</w:t>
+        <w:t xml:space="preserve">D. I. MacKenzie, J. D. Nichols, G. B. Lachman, S. Droege, J. A. Royle, C. A. Langtimm, Estimating site occupancy rates when detection probabilities are less than one.</w:t>
+      </w:r>
+      <w:r>
+        <w:t xml:space="preserve"> </w:t>
+      </w:r>
+      <w:r>
+        <w:rPr>
+          <w:i/>
+          <w:iCs/>
+        </w:rPr>
+        <w:t xml:space="preserve">Ecology</w:t>
+      </w:r>
+      <w:r>
+        <w:t xml:space="preserve"> </w:t>
+      </w:r>
+      <w:r>
+        <w:rPr>
+          <w:b/>
+          <w:bCs/>
+        </w:rPr>
+        <w:t xml:space="preserve">83</w:t>
+      </w:r>
+      <w:r>
+        <w:t xml:space="preserve">, 2248–2255 (2002).</w:t>
       </w:r>
     </w:p>
     <w:p>
@@ -899,30 +893,30 @@
         <w:spacing w:lineRule="auto" w:line="360"/>
       </w:pPr>
       <w:r>
-        <w:t xml:space="preserve">D. I. MacKenzie, J. D. Nichols, G. B. Lachman, S. Droege, J. A. Royle, C. A. Langtimm, Estimating site occupancy rates when detection probabilities are less than one.</w:t>
-      </w:r>
-      <w:r>
-        <w:t xml:space="preserve"> </w:t>
-      </w:r>
-      <w:r>
-        <w:rPr>
-          <w:i/>
-          <w:iCs/>
-        </w:rPr>
-        <w:t xml:space="preserve">Ecology</w:t>
-      </w:r>
-      <w:r>
-        <w:t xml:space="preserve"> </w:t>
-      </w:r>
-      <w:r>
-        <w:rPr>
-          <w:b/>
-          <w:bCs/>
-        </w:rPr>
-        <w:t xml:space="preserve">83</w:t>
-      </w:r>
-      <w:r>
-        <w:t xml:space="preserve">, 2248–2255 (2002).</w:t>
+        <w:t xml:space="preserve">L. Jost, Entropy and diversity.</w:t>
+      </w:r>
+      <w:r>
+        <w:t xml:space="preserve"> </w:t>
+      </w:r>
+      <w:r>
+        <w:rPr>
+          <w:i/>
+          <w:iCs/>
+        </w:rPr>
+        <w:t xml:space="preserve">Oikos</w:t>
+      </w:r>
+      <w:r>
+        <w:t xml:space="preserve"> </w:t>
+      </w:r>
+      <w:r>
+        <w:rPr>
+          <w:b/>
+          <w:bCs/>
+        </w:rPr>
+        <w:t xml:space="preserve">113</w:t>
+      </w:r>
+      <w:r>
+        <w:t xml:space="preserve">, 363–375 (2006).</w:t>
       </w:r>
     </w:p>
     <w:p>
@@ -935,30 +929,30 @@
         <w:spacing w:lineRule="auto" w:line="360"/>
       </w:pPr>
       <w:r>
-        <w:t xml:space="preserve">L. Jost, Entropy and diversity.</w:t>
-      </w:r>
-      <w:r>
-        <w:t xml:space="preserve"> </w:t>
-      </w:r>
-      <w:r>
-        <w:rPr>
-          <w:i/>
-          <w:iCs/>
-        </w:rPr>
-        <w:t xml:space="preserve">Oikos</w:t>
-      </w:r>
-      <w:r>
-        <w:t xml:space="preserve"> </w:t>
-      </w:r>
-      <w:r>
-        <w:rPr>
-          <w:b/>
-          <w:bCs/>
-        </w:rPr>
-        <w:t xml:space="preserve">113</w:t>
-      </w:r>
-      <w:r>
-        <w:t xml:space="preserve">, 363–375 (2006).</w:t>
+        <w:t xml:space="preserve">A. Chao, N. J. Gotelli, T. C. Hsieh, E. L. Sander, K. H. Ma, R. K. Colwell, A. M. Ellison, Rarefaction and extrapolation with Hill numbers: a framework for sampling and estimation in species diversity studies.</w:t>
+      </w:r>
+      <w:r>
+        <w:t xml:space="preserve"> </w:t>
+      </w:r>
+      <w:r>
+        <w:rPr>
+          <w:i/>
+          <w:iCs/>
+        </w:rPr>
+        <w:t xml:space="preserve">Ecol. Monogr.</w:t>
+      </w:r>
+      <w:r>
+        <w:t xml:space="preserve"> </w:t>
+      </w:r>
+      <w:r>
+        <w:rPr>
+          <w:b/>
+          <w:bCs/>
+        </w:rPr>
+        <w:t xml:space="preserve">84</w:t>
+      </w:r>
+      <w:r>
+        <w:t xml:space="preserve">, 45–67 (2014).</w:t>
       </w:r>
     </w:p>
     <w:p>
@@ -971,42 +965,6 @@
         <w:spacing w:lineRule="auto" w:line="360"/>
       </w:pPr>
       <w:r>
-        <w:t xml:space="preserve">A. Chao, N. J. Gotelli, T. C. Hsieh, E. L. Sander, K. H. Ma, R. K. Colwell, A. M. Ellison, Rarefaction and extrapolation with Hill numbers: a framework for sampling and estimation in species diversity studies.</w:t>
-      </w:r>
-      <w:r>
-        <w:t xml:space="preserve"> </w:t>
-      </w:r>
-      <w:r>
-        <w:rPr>
-          <w:i/>
-          <w:iCs/>
-        </w:rPr>
-        <w:t xml:space="preserve">Ecol. Monogr.</w:t>
-      </w:r>
-      <w:r>
-        <w:t xml:space="preserve"> </w:t>
-      </w:r>
-      <w:r>
-        <w:rPr>
-          <w:b/>
-          <w:bCs/>
-        </w:rPr>
-        <w:t xml:space="preserve">84</w:t>
-      </w:r>
-      <w:r>
-        <w:t xml:space="preserve">, 45–67 (2014).</w:t>
-      </w:r>
-    </w:p>
-    <w:p>
-      <w:pPr>
-        <w:pStyle w:val="Compact"/>
-        <w:numPr>
-          <w:ilvl w:val="0"/>
-          <w:numId w:val="1001"/>
-        </w:numPr>
-        <w:spacing w:lineRule="auto" w:line="360"/>
-      </w:pPr>
-      <w:r>
         <w:t xml:space="preserve">J. K. Szabo, P. A. Vesk, P. W. J. Baxter, H. P. Possingham, Regional avian species declines estimated from volunteer-collected long-term data using List Length Analysis.</w:t>
       </w:r>
       <w:r>
@@ -1287,7 +1245,7 @@
       <w:r>
         <w:drawing>
           <wp:inline>
-            <wp:extent cx="5334000" cy="3264329"/>
+            <wp:extent cx="5334000" cy="2973069"/>
             <wp:effectExtent b="0" l="0" r="0" t="0"/>
             <wp:docPr descr="" title="" id="15" name="Picture"/>
             <a:graphic>
@@ -1308,7 +1266,7 @@
                   <pic:spPr bwMode="auto">
                     <a:xfrm>
                       <a:off x="0" y="0"/>
-                      <a:ext cx="5334000" cy="3264329"/>
+                      <a:ext cx="5334000" cy="2973069"/>
                     </a:xfrm>
                     <a:prstGeom prst="rect">
                       <a:avLst/>
@@ -1348,7 +1306,7 @@
       <w:r>
         <w:drawing>
           <wp:inline>
-            <wp:extent cx="4866623" cy="5228414"/>
+            <wp:extent cx="5334000" cy="2506560"/>
             <wp:effectExtent b="0" l="0" r="0" t="0"/>
             <wp:docPr descr="" title="" id="18" name="Picture"/>
             <a:graphic>
@@ -1369,7 +1327,7 @@
                   <pic:spPr bwMode="auto">
                     <a:xfrm>
                       <a:off x="0" y="0"/>
-                      <a:ext cx="4866623" cy="5228414"/>
+                      <a:ext cx="5334000" cy="2506560"/>
                     </a:xfrm>
                     <a:prstGeom prst="rect">
                       <a:avLst/>

</xml_diff>

<commit_message>
Cover letter closes on data and statistical-bias caution; fix availability statements for the private repository
</commit_message>
<xml_diff>
--- a/submission/01_Technical_Comment_Science.docx
+++ b/submission/01_Technical_Comment_Science.docx
@@ -1075,7 +1075,7 @@
         <w:t xml:space="preserve"> </w:t>
       </w:r>
       <w:r>
-        <w:t xml:space="preserve">All analyses use the original authors’ public replication package (github.com/jianke22/China-s-solar-expansion-policy-reduces-bird-diversity). R scripts, derived tables, and figure source data reproducing every number in this Comment are available at github.com/dingchenchen6/reanalysis-zhang2026-solar-birds and will be archived with a DOI upon acceptance. Record-level birdwatching-platform data used for species-level verification are held under a data agreement with the China Birdwatching Record Center; aggregated verification outputs are included in the repository.</w:t>
+        <w:t xml:space="preserve">All analyses use the original authors’ public replication package (github.com/jianke22/China-s-solar-expansion-policy-reduces-bird-diversity). R scripts, derived tables, and figure source data reproducing every number in this Comment are available to the editors and reviewers on request and will be archived publicly with a DOI upon acceptance. Record-level birdwatching-platform data used for species-level verification are held under a data agreement with the China Birdwatching Record Center; aggregated verification outputs are included in the repository.</w:t>
       </w:r>
     </w:p>
     <w:bookmarkEnd w:id="12"/>
@@ -1801,9 +1801,9 @@
       <w:outlineLvl w:val="0"/>
     </w:pPr>
     <w:rPr>
-      <w:rFonts w:asciiTheme="majorHAnsi" w:cstheme="majorBidi" w:eastAsiaTheme="majorEastAsia" w:hAnsiTheme="majorHAnsi" w:ascii="Times New Roman" w:hAnsi="Times New Roman"/>
+      <w:rFonts w:asciiTheme="majorHAnsi" w:cstheme="majorBidi" w:eastAsiaTheme="majorEastAsia" w:hAnsiTheme="majorHAnsi"/>
       <w:color w:themeColor="accent1" w:themeShade="BF" w:val="0F4761"/>
-      <w:sz w:val="32"/>
+      <w:sz w:val="40"/>
       <w:szCs w:val="40"/>
     </w:rPr>
   </w:style>
@@ -1824,9 +1824,9 @@
       <w:outlineLvl w:val="1"/>
     </w:pPr>
     <w:rPr>
-      <w:rFonts w:asciiTheme="majorHAnsi" w:cstheme="majorBidi" w:eastAsiaTheme="majorEastAsia" w:hAnsiTheme="majorHAnsi" w:ascii="Times New Roman" w:hAnsi="Times New Roman"/>
+      <w:rFonts w:asciiTheme="majorHAnsi" w:cstheme="majorBidi" w:eastAsiaTheme="majorEastAsia" w:hAnsiTheme="majorHAnsi"/>
       <w:color w:themeColor="accent1" w:themeShade="BF" w:val="0F4761"/>
-      <w:sz w:val="28"/>
+      <w:sz w:val="32"/>
       <w:szCs w:val="32"/>
     </w:rPr>
   </w:style>
@@ -1847,9 +1847,9 @@
       <w:outlineLvl w:val="2"/>
     </w:pPr>
     <w:rPr>
-      <w:rFonts w:cstheme="majorBidi" w:eastAsiaTheme="majorEastAsia" w:ascii="Times New Roman" w:hAnsi="Times New Roman"/>
+      <w:rFonts w:cstheme="majorBidi" w:eastAsiaTheme="majorEastAsia"/>
       <w:color w:themeColor="accent1" w:themeShade="BF" w:val="0F4761"/>
-      <w:sz w:val="24"/>
+      <w:sz w:val="28"/>
       <w:szCs w:val="28"/>
     </w:rPr>
   </w:style>

</xml_diff>

<commit_message>
Embed checklist-type mechanism with first-hand counts (46,997/100,313; 123,232/282,197)
The all-ones argument now states its distortion mechanism in one line:
treating every species as one individual inflates rare-species weight,
suppresses true dominants, and drives Shannon toward log richness, so
nearly half of the raw material measures list length rather than
community structure. Main text back at 1000 words.
</commit_message>
<xml_diff>
--- a/submission/01_Technical_Comment_Science.docx
+++ b/submission/01_Technical_Comment_Science.docx
@@ -223,7 +223,7 @@
         <w:t xml:space="preserve">7</w:t>
       </w:r>
       <w:r>
-        <w:t xml:space="preserve">). The dependent variable here is a Shannon index computed from unstructured birdwatching reports within each county-month. In the estimation sample, 38.8% of county-months rest on a single birdwatcher and the median county is observed in 11 of 120 months (Fig. 1C). Observed richness and Shannon diversity are steep, saturating functions of the number of birdwatchers present (Fig. 1B): county-months with one birder average 15 species (H = 1.90), while those with &gt;100 birders average 142 species (H = 3.60). This is a species-accumulation curve, not a community property. The authors’ own supplementary results carry its signature: PSI associates with lower observed richness but higher evenness (their table S19), the mechanical signature of shorter species lists; in our reproduction, evenness declines monotonically with effort (0.84 at one birder; 0.73 above 100).</w:t>
+        <w:t xml:space="preserve">). The dependent variable here is a Shannon index computed from unstructured birdwatching reports within each county-month. In the estimation sample, 38.8% of county-months rest on a single birdwatcher and the median county is observed in 11 of 120 months (Fig. 1C). Observed richness and Shannon diversity are saturating functions of the number of birdwatchers present (Fig. 1B): county-months with one birder average 15 species (H = 1.90); those with &gt;100 birders average 142 species (H = 3.60). This is a species-accumulation curve, not a community property. The authors’ own results carry its signature: PSI associates with lower observed richness but higher evenness (their table S19), the mechanical signature of shorter lists; in our reproduction, evenness declines monotonically with effort (0.84 at one birder; 0.73 above 100).</w:t>
       </w:r>
     </w:p>
     <w:p>
@@ -232,7 +232,7 @@
         <w:spacing w:lineRule="auto" w:line="360"/>
       </w:pPr>
       <w:r>
-        <w:t xml:space="preserve">The input data are also unvalidated. In record-level platform data held by our own project, every count equals one in 46.9% of 2014–2023 checklists (43.7% in the platform’s raw 2024 delivery, whose count field we verified as genuine abundance); such records carry no usable abundance information and cannot support abundance-weighted indices. Corrupted counts also reach the published analysis directly: the Shannon value for Xinhui County in March 2015 is 8 × 10⁻⁷ with four species recorded, against 2.2–2.9 in adjacent months; arithmetically, such a value requires a single species count of at least tens of millions. This entry enters the regression as an observation of the dependent variable (Fig. 1D). Eighteen more county-months share this signature (≥20 species, H &lt; 0.2). No data-quality screening is described in (</w:t>
+        <w:t xml:space="preserve">The input data are also unvalidated. In record-level platform data held by our own project, every count equals one in 46,997 of 100,313 checklists from 2014–2023 (46.9%; 43.7% in the platform’s raw 2024 delivery, whose count field we verified). These checklist-type records carry no abundance information: treating every species as one individual inflates rare species’ weight, suppresses true dominants, and drives the Shannon index toward log richness, so nearly half of the raw material measures list length, not community structure. Corrupted counts also reach the published analysis directly: the Shannon value for Xinhui County in March 2015 is 8 × 10⁻⁷ with four species recorded, against 2.2–2.9 in adjacent months; arithmetically, such a value requires a single species count of at least tens of millions. This entry enters the regression as a dependent-variable observation (Fig. 1D). Eighteen more county-months share this signature (≥20 species, H &lt; 0.2). No data-quality screening is described in (</w:t>
       </w:r>
       <w:r>
         <w:rPr>
@@ -261,7 +261,7 @@
         <w:t xml:space="preserve"> </w:t>
       </w:r>
       <w:r>
-        <w:t xml:space="preserve">Summed birdwatcher counts grew 171-fold over 2014–2023 and observed county-months 25-fold, precisely as mean PSI quadrupled (Fig. 1A). The authors control only for</w:t>
+        <w:t xml:space="preserve">Summed birdwatcher counts grew 171-fold over 2014–2023 and observed county-months 25-fold, as mean PSI quadrupled (Fig. 1A). The authors control only for</w:t>
       </w:r>
       <w:r>
         <w:t xml:space="preserve"> </w:t>
@@ -354,7 +354,7 @@
         <w:t xml:space="preserve"> </w:t>
       </w:r>
       <w:r>
-        <w:t xml:space="preserve">= 2 × 10⁻¹¹), an association unlikely to reflect birdwatcher behaviour. The association shrinks by 81% within policy-documented counties (β = −0.008,</w:t>
+        <w:t xml:space="preserve">= 2 × 10⁻¹¹). The association shrinks by 81% within policy-documented counties (β = −0.008,</w:t>
       </w:r>
       <w:r>
         <w:t xml:space="preserve"> </w:t>
@@ -398,7 +398,7 @@
         <w:t xml:space="preserve"> </w:t>
       </w:r>
       <w:r>
-        <w:t xml:space="preserve">&lt; 10⁻⁵), a causally impossible direction that indicates differential county trends; and PSI does not predict realized PV area within counties (</w:t>
+        <w:t xml:space="preserve">&lt; 10⁻⁵), a causally impossible direction indicating differential county trends; and PSI does not predict realized PV area within counties (</w:t>
       </w:r>
       <w:r>
         <w:rPr>
@@ -411,7 +411,7 @@
         <w:t xml:space="preserve"> </w:t>
       </w:r>
       <w:r>
-        <w:t xml:space="preserve">= 0.27), which weakens any construction-disturbance pathway. A design in which future policy shifts a non-ecological outcome can generate spurious effects for any outcome, including birds.</w:t>
+        <w:t xml:space="preserve">= 0.27), weakening any construction-disturbance pathway. A design in which future policy shifts a non-ecological outcome can generate spurious effects for any outcome, including birds.</w:t>
       </w:r>
     </w:p>
     <w:p>
@@ -440,7 +440,7 @@
         <w:t xml:space="preserve">7</w:t>
       </w:r>
       <w:r>
-        <w:t xml:space="preserve">). Within the authors’ own specification (same data, fixed effects, and clustering), adding ln(birdwatchers) flips the PSI coefficient to +0.0032 (</w:t>
+        <w:t xml:space="preserve">). In the authors’ own specification (same data, fixed effects, clustering), adding ln(birdwatchers) flips the PSI coefficient to +0.0032 (</w:t>
       </w:r>
       <w:r>
         <w:rPr>
@@ -453,7 +453,7 @@
         <w:t xml:space="preserve"> </w:t>
       </w:r>
       <w:r>
-        <w:t xml:space="preserve">= 0.31); adding ln(total hours) or both terms gives the same null (Fig. 2A). The richness decline of −0.98 species per PSI unit (their table S19) shrinks by 92% to −0.07 (</w:t>
+        <w:t xml:space="preserve">= 0.31); ln(total hours) or both terms give the same null (Fig. 2A). The richness decline of −0.98 species per PSI unit (their table S19) shrinks by 92% to −0.07 (</w:t>
       </w:r>
       <w:r>
         <w:rPr>
@@ -511,7 +511,7 @@
         <w:t xml:space="preserve"> </w:t>
       </w:r>
       <w:r>
-        <w:t xml:space="preserve">= 0.49). Even taken at face value, PSI adds 0.0003 to the model’s R², or 0.03% of the variance in Shannon diversity, against 31% absorbed by fixed effects (Fig. 2B); the implied one-standard-deviation shift (0.052 on H) is 6.5% of the residual standard deviation (0.80). A statistically significant coefficient of this size, estimated from a contaminated, effort-driven outcome, carries little ecological information (</w:t>
+        <w:t xml:space="preserve">= 0.49). Even taken at face value, PSI adds 0.0003 to the model’s R², or 0.03% of Shannon variance, against 31% absorbed by fixed effects (Fig. 2B); a one-standard-deviation shift (0.052 on H) is 6.5% of the residual standard deviation (0.80). A statistically significant coefficient of this size, estimated from a contaminated, effort-driven outcome, carries little ecological information (</w:t>
       </w:r>
       <w:r>
         <w:rPr>
@@ -543,7 +543,7 @@
         <w:spacing w:lineRule="auto" w:line="360"/>
       </w:pPr>
       <w:r>
-        <w:t xml:space="preserve">To establish what the data do support, we estimated all 36 combinations of sample (full or policy-documented), cleaning (as published, corrupted rows removed, or ≥2 birders), metric (Shannon, Simpson, log richness), and effort adjustment (fig. S1). All seven significant negative estimates come from paths without effort terms; all 18 effort-adjusted paths are null (median +0.10%). Our preferred estimate (corrupted records removed, policy-documented counties, explicit effort terms) is +0.14% for Shannon diversity (95% CI, −0.96 to +1.24%), an interval that excludes the published −2.10%. Had that effect been real, this corrected design would have detected it with 96% power.</w:t>
+        <w:t xml:space="preserve">To establish what the data support, we estimated all 36 combinations of sample (full or policy-documented), cleaning (as published, corrupted rows removed, or ≥2 birders), metric (Shannon, Simpson, log richness), and effort adjustment (fig. S1). All seven significant negative estimates come from paths without effort terms; all 18 effort-adjusted paths are null (median +0.10%). Our preferred estimate (corrupted records removed, policy-documented counties, explicit effort terms) is +0.14% for Shannon diversity (95% CI, −0.96 to +1.24%), an interval that excludes the published −2.10%. Had that effect been real, this corrected design would have detected it with 96% power.</w:t>
       </w:r>
     </w:p>
     <w:p>
@@ -608,7 +608,7 @@
         <w:t xml:space="preserve">10</w:t>
       </w:r>
       <w:r>
-        <w:t xml:space="preserve">), whereas abundance-weighted indices such as Shannon additionally require complete checklists, validated counts, and detection-heterogeneity corrections. None of these conditions is met here. The broader caution stands: data defects and fitness for purpose must be established before citizen-science records anchor national-scale causal claims.</w:t>
+        <w:t xml:space="preserve">); abundance-weighted indices additionally require complete checklists and validated counts. None of these conditions is met here. The broader caution stands: data defects and fitness for purpose must be established before citizen-science records anchor national-scale causal claims.</w:t>
       </w:r>
     </w:p>
     <w:p>

</xml_diff>

<commit_message>
Rebase manuscript on the author's edited version; embed checklist-type mechanism
User edits kept: no title-page author block, trimmed one-sentence summary,
abstract without the column/date note. Applied on top: checklist-type
mechanism with first-hand counts (46,997/100,313; 123,232/282,197),
self-evident Fig 1D legend (fixing an earlier missed replacement),
on-request availability statement (repository now private), and the
journal-convention figures. Word limit relaxed per author (1,032 words).
</commit_message>
<xml_diff>
--- a/submission/01_Technical_Comment_Science.docx
+++ b/submission/01_Technical_Comment_Science.docx
@@ -27,62 +27,13 @@
           <w:b/>
           <w:bCs/>
         </w:rPr>
-        <w:t xml:space="preserve">Chenchen Ding</w:t>
-      </w:r>
-      <w:r>
-        <w:rPr>
-          <w:vertAlign w:val="superscript"/>
-        </w:rPr>
-        <w:t xml:space="preserve">1</w:t>
-      </w:r>
-      <w:r>
-        <w:t xml:space="preserve">*</w:t>
-      </w:r>
-    </w:p>
-    <w:p>
-      <w:pPr>
-        <w:pStyle w:val="BodyText"/>
-        <w:spacing w:lineRule="auto" w:line="360"/>
-      </w:pPr>
-      <w:r>
-        <w:rPr>
-          <w:vertAlign w:val="superscript"/>
-        </w:rPr>
-        <w:t xml:space="preserve">1</w:t>
-      </w:r>
-      <w:r>
-        <w:t xml:space="preserve"> </w:t>
-      </w:r>
-      <w:r>
-        <w:t xml:space="preserve">School of Life Sciences and Institute of Ecology, Peking University, Beijing 100871, China.</w:t>
-      </w:r>
-    </w:p>
-    <w:p>
-      <w:pPr>
-        <w:pStyle w:val="BodyText"/>
-        <w:spacing w:lineRule="auto" w:line="360"/>
-      </w:pPr>
-      <w:r>
-        <w:t xml:space="preserve">* Corresponding author. Email: dingchenchen@pku.edu.cn</w:t>
-      </w:r>
-    </w:p>
-    <w:p>
-      <w:pPr>
-        <w:pStyle w:val="BodyText"/>
-        <w:spacing w:lineRule="auto" w:line="360"/>
-      </w:pPr>
-      <w:r>
-        <w:rPr>
-          <w:b/>
-          <w:bCs/>
-        </w:rPr>
         <w:t xml:space="preserve">One-sentence summary:</w:t>
       </w:r>
       <w:r>
         <w:t xml:space="preserve"> </w:t>
       </w:r>
       <w:r>
-        <w:t xml:space="preserve">The reported decline in bird diversity under China’s solar-expansion policy reflects birdwatching effort and unvalidated data, not bird communities, and vanishes under standard corrections.</w:t>
+        <w:t xml:space="preserve">The reported decline in bird diversity under China’s solar-expansion policy reflects birdwatching effort, not bird communities, and vanishes under standard corrections.</w:t>
       </w:r>
     </w:p>
     <w:bookmarkStart w:id="9" w:name="abstract"/>
@@ -113,7 +64,7 @@
         <w:t xml:space="preserve">et al</w:t>
       </w:r>
       <w:r>
-        <w:t xml:space="preserve">. (Research Articles, 21 August 2026) report that solar-policy stringency reduced county-level bird diversity across China. Reanalyzing their public replication data, we show their outcome variable tracks birdwatching effort rather than bird communities; correcting effort, data contamination, and unvalidated policy zeros eliminates the reported effect entirely.</w:t>
+        <w:t xml:space="preserve">. report that solar-policy stringency reduced county-level bird diversity across China. Reanalyzing their public replication data, we show their outcome variable tracks birdwatching effort rather than bird communities; correcting effort, data contamination, and unvalidated policy zeros eliminates the reported effect entirely.</w:t>
       </w:r>
     </w:p>
     <w:bookmarkEnd w:id="9"/>
@@ -223,7 +174,7 @@
         <w:t xml:space="preserve">7</w:t>
       </w:r>
       <w:r>
-        <w:t xml:space="preserve">). The dependent variable here is a Shannon index computed from unstructured birdwatching reports within each county-month. In the estimation sample, 38.8% of county-months rest on a single birdwatcher and the median county is observed in 11 of 120 months (Fig. 1C). Observed richness and Shannon diversity are saturating functions of the number of birdwatchers present (Fig. 1B): county-months with one birder average 15 species (H = 1.90); those with &gt;100 birders average 142 species (H = 3.60). This is a species-accumulation curve, not a community property. The authors’ own results carry its signature: PSI associates with lower observed richness but higher evenness (their table S19), the mechanical signature of shorter lists; in our reproduction, evenness declines monotonically with effort (0.84 at one birder; 0.73 above 100).</w:t>
+        <w:t xml:space="preserve">). The dependent variable here is a Shannon index computed from unstructured birdwatching reports within each county-month. In the estimation sample, 38.8% of county-months rest on a single birdwatcher and the median county is observed in 11 of 120 months (Fig. 1C). Observed richness and Shannon diversity are steep, saturating functions of the number of birdwatchers present (Fig. 1B): county-months with one birder average 15 species (H = 1.90), while those with &gt;100 birders average 142 species (H = 3.60). This is a species-accumulation curve, not a community property. The authors’ own supplementary results carry its signature: PSI associates with lower observed richness but higher evenness (their table S19), the mechanical signature of shorter species lists; in our reproduction, evenness declines monotonically with effort (0.84 at one birder; 0.73 above 100).</w:t>
       </w:r>
     </w:p>
     <w:p>
@@ -232,7 +183,7 @@
         <w:spacing w:lineRule="auto" w:line="360"/>
       </w:pPr>
       <w:r>
-        <w:t xml:space="preserve">The input data are also unvalidated. In record-level platform data held by our own project, every count equals one in 46,997 of 100,313 checklists from 2014–2023 (46.9%; 43.7% in the platform’s raw 2024 delivery, whose count field we verified). These checklist-type records carry no abundance information: treating every species as one individual inflates rare species’ weight, suppresses true dominants, and drives the Shannon index toward log richness, so nearly half of the raw material measures list length, not community structure. Corrupted counts also reach the published analysis directly: the Shannon value for Xinhui County in March 2015 is 8 × 10⁻⁷ with four species recorded, against 2.2–2.9 in adjacent months; arithmetically, such a value requires a single species count of at least tens of millions. This entry enters the regression as a dependent-variable observation (Fig. 1D). Eighteen more county-months share this signature (≥20 species, H &lt; 0.2). No data-quality screening is described in (</w:t>
+        <w:t xml:space="preserve">The input data are also unvalidated. In record-level platform data held by our own project, every count equals one in 46,997 of 100,313 checklists from 2014–2023 (46.9%; 43.7% in the platform’s raw 2024 delivery, whose count field we verified as genuine abundance). These checklist-type records carry no abundance information: treating every species as one individual inflates the weight of rare species, suppresses true dominants, and drives the Shannon index toward log richness, so nearly half of the raw material measures list length rather than community structure. Corrupted counts also reach the published analysis directly: the Shannon value for Xinhui County in March 2015 is 8 × 10⁻⁷ with four species recorded, against 2.2–2.9 in adjacent months; arithmetically, such a value requires a single species count of at least tens of millions. This entry enters the regression as an observation of the dependent variable (Fig. 1D). Eighteen more county-months share this signature (≥20 species, H &lt; 0.2). No data-quality screening is described in (</w:t>
       </w:r>
       <w:r>
         <w:rPr>
@@ -261,7 +212,7 @@
         <w:t xml:space="preserve"> </w:t>
       </w:r>
       <w:r>
-        <w:t xml:space="preserve">Summed birdwatcher counts grew 171-fold over 2014–2023 and observed county-months 25-fold, as mean PSI quadrupled (Fig. 1A). The authors control only for</w:t>
+        <w:t xml:space="preserve">Summed birdwatcher counts grew 171-fold over 2014–2023 and observed county-months 25-fold, precisely as mean PSI quadrupled (Fig. 1A). The authors control only for</w:t>
       </w:r>
       <w:r>
         <w:t xml:space="preserve"> </w:t>
@@ -354,7 +305,7 @@
         <w:t xml:space="preserve"> </w:t>
       </w:r>
       <w:r>
-        <w:t xml:space="preserve">= 2 × 10⁻¹¹). The association shrinks by 81% within policy-documented counties (β = −0.008,</w:t>
+        <w:t xml:space="preserve">= 2 × 10⁻¹¹), an association unlikely to reflect birdwatcher behaviour. The association shrinks by 81% within policy-documented counties (β = −0.008,</w:t>
       </w:r>
       <w:r>
         <w:t xml:space="preserve"> </w:t>
@@ -398,7 +349,7 @@
         <w:t xml:space="preserve"> </w:t>
       </w:r>
       <w:r>
-        <w:t xml:space="preserve">&lt; 10⁻⁵), a causally impossible direction indicating differential county trends; and PSI does not predict realized PV area within counties (</w:t>
+        <w:t xml:space="preserve">&lt; 10⁻⁵), a causally impossible direction that indicates differential county trends; and PSI does not predict realized PV area within counties (</w:t>
       </w:r>
       <w:r>
         <w:rPr>
@@ -411,7 +362,7 @@
         <w:t xml:space="preserve"> </w:t>
       </w:r>
       <w:r>
-        <w:t xml:space="preserve">= 0.27), weakening any construction-disturbance pathway. A design in which future policy shifts a non-ecological outcome can generate spurious effects for any outcome, including birds.</w:t>
+        <w:t xml:space="preserve">= 0.27), which weakens any construction-disturbance pathway. A design in which future policy shifts a non-ecological outcome can generate spurious effects for any outcome, including birds.</w:t>
       </w:r>
     </w:p>
     <w:p>
@@ -440,7 +391,7 @@
         <w:t xml:space="preserve">7</w:t>
       </w:r>
       <w:r>
-        <w:t xml:space="preserve">). In the authors’ own specification (same data, fixed effects, clustering), adding ln(birdwatchers) flips the PSI coefficient to +0.0032 (</w:t>
+        <w:t xml:space="preserve">). Within the authors’ own specification (same data, fixed effects, and clustering), adding ln(birdwatchers) flips the PSI coefficient to +0.0032 (</w:t>
       </w:r>
       <w:r>
         <w:rPr>
@@ -453,7 +404,7 @@
         <w:t xml:space="preserve"> </w:t>
       </w:r>
       <w:r>
-        <w:t xml:space="preserve">= 0.31); ln(total hours) or both terms give the same null (Fig. 2A). The richness decline of −0.98 species per PSI unit (their table S19) shrinks by 92% to −0.07 (</w:t>
+        <w:t xml:space="preserve">= 0.31); adding ln(total hours) or both terms gives the same null (Fig. 2A). The richness decline of −0.98 species per PSI unit (their table S19) shrinks by 92% to −0.07 (</w:t>
       </w:r>
       <w:r>
         <w:rPr>
@@ -511,7 +462,7 @@
         <w:t xml:space="preserve"> </w:t>
       </w:r>
       <w:r>
-        <w:t xml:space="preserve">= 0.49). Even taken at face value, PSI adds 0.0003 to the model’s R², or 0.03% of Shannon variance, against 31% absorbed by fixed effects (Fig. 2B); a one-standard-deviation shift (0.052 on H) is 6.5% of the residual standard deviation (0.80). A statistically significant coefficient of this size, estimated from a contaminated, effort-driven outcome, carries little ecological information (</w:t>
+        <w:t xml:space="preserve">= 0.49). Even taken at face value, PSI adds 0.0003 to the model’s R², or 0.03% of the variance in Shannon diversity, against 31% absorbed by fixed effects (Fig. 2B); the implied one-standard-deviation shift (0.052 on H) is 6.5% of the residual standard deviation (0.80). A statistically significant coefficient of this size, estimated from a contaminated, effort-driven outcome, carries little ecological information (</w:t>
       </w:r>
       <w:r>
         <w:rPr>
@@ -543,7 +494,7 @@
         <w:spacing w:lineRule="auto" w:line="360"/>
       </w:pPr>
       <w:r>
-        <w:t xml:space="preserve">To establish what the data support, we estimated all 36 combinations of sample (full or policy-documented), cleaning (as published, corrupted rows removed, or ≥2 birders), metric (Shannon, Simpson, log richness), and effort adjustment (fig. S1). All seven significant negative estimates come from paths without effort terms; all 18 effort-adjusted paths are null (median +0.10%). Our preferred estimate (corrupted records removed, policy-documented counties, explicit effort terms) is +0.14% for Shannon diversity (95% CI, −0.96 to +1.24%), an interval that excludes the published −2.10%. Had that effect been real, this corrected design would have detected it with 96% power.</w:t>
+        <w:t xml:space="preserve">To establish what the data do support, we estimated all 36 combinations of sample (full or policy-documented), cleaning (as published, corrupted rows removed, or ≥2 birders), metric (Shannon, Simpson, log richness), and effort adjustment (fig. S1). All seven significant negative estimates come from paths without effort terms; all 18 effort-adjusted paths are null (median +0.10%). Our preferred estimate (corrupted records removed, policy-documented counties, explicit effort terms) is +0.14% for Shannon diversity (95% CI, −0.96 to +1.24%), an interval that excludes the published −2.10%. Had that effect been real, this corrected design would have detected it with 96% power.</w:t>
       </w:r>
     </w:p>
     <w:p>
@@ -608,17 +559,7 @@
         <w:t xml:space="preserve">10</w:t>
       </w:r>
       <w:r>
-        <w:t xml:space="preserve">); abundance-weighted indices additionally require complete checklists and validated counts. None of these conditions is met here. The broader caution stands: data defects and fitness for purpose must be established before citizen-science records anchor national-scale causal claims.</w:t>
-      </w:r>
-    </w:p>
-    <w:p>
-      <w:pPr>
-        <w:spacing w:lineRule="auto" w:line="360"/>
-      </w:pPr>
-      <w:r>
-        <w:pict>
-          <v:rect style="width:0;height:1.5pt" o:hralign="center" o:hrstd="t" o:hr="t"/>
-        </w:pict>
+        <w:t xml:space="preserve">), whereas abundance-weighted indices such as Shannon additionally require complete checklists, validated counts, and detection-heterogeneity corrections. None of these conditions is met here. The broader caution stands: data defects and fitness for purpose must be established before citizen-science records anchor national-scale causal claims.</w:t>
       </w:r>
     </w:p>
     <w:bookmarkEnd w:id="10"/>
@@ -991,16 +932,6 @@
         <w:t xml:space="preserve">, 2157–2169 (2010).</w:t>
       </w:r>
     </w:p>
-    <w:p>
-      <w:pPr>
-        <w:spacing w:lineRule="auto" w:line="360"/>
-      </w:pPr>
-      <w:r>
-        <w:pict>
-          <v:rect style="width:0;height:1.5pt" o:hralign="center" o:hrstd="t" o:hr="t"/>
-        </w:pict>
-      </w:r>
-    </w:p>
     <w:bookmarkEnd w:id="11"/>
     <w:bookmarkStart w:id="12" w:name="acknowledgments"/>
     <w:p>
@@ -1029,41 +960,12 @@
       <w:r>
         <w:t xml:space="preserve">The author received no specific funding for this work.</w:t>
       </w:r>
-      <w:r>
-        <w:t xml:space="preserve"> </w:t>
-      </w:r>
-      <w:r>
-        <w:rPr>
-          <w:b/>
-          <w:bCs/>
-        </w:rPr>
-        <w:t xml:space="preserve">Author contributions:</w:t>
-      </w:r>
-      <w:r>
-        <w:t xml:space="preserve"> </w:t>
-      </w:r>
-      <w:r>
-        <w:t xml:space="preserve">C.D. conceived the reanalysis, performed all analyses, and wrote the manuscript.</w:t>
-      </w:r>
-      <w:r>
-        <w:t xml:space="preserve"> </w:t>
-      </w:r>
-      <w:r>
-        <w:rPr>
-          <w:b/>
-          <w:bCs/>
-        </w:rPr>
-        <w:t xml:space="preserve">Competing interests:</w:t>
-      </w:r>
-      <w:r>
-        <w:t xml:space="preserve"> </w:t>
-      </w:r>
-      <w:r>
-        <w:t xml:space="preserve">The author declares no competing interests.</w:t>
-      </w:r>
-      <w:r>
-        <w:t xml:space="preserve"> </w:t>
-      </w:r>
+    </w:p>
+    <w:p>
+      <w:pPr>
+        <w:pStyle w:val="BodyText"/>
+        <w:spacing w:lineRule="auto" w:line="360"/>
+      </w:pPr>
       <w:r>
         <w:rPr>
           <w:b/>
@@ -1186,7 +1088,7 @@
         <w:t xml:space="preserve">D</w:t>
       </w:r>
       <w:r>
-        <w:t xml:space="preserve">) Monthly Shannon H for Xinhui County, Guangdong: a single record of 2,147,483,647 little egrets (the int32 maximum) collapses March 2015 to H = 8 × 10</w:t>
+        <w:t xml:space="preserve">) Monthly Shannon H for Xinhui County, Guangdong: a corrupted entry collapses March 2015 to H = 8 × 10</w:t>
       </w:r>
       <w:r>
         <w:rPr>
@@ -1195,7 +1097,10 @@
         <w:t xml:space="preserve">−7</w:t>
       </w:r>
       <w:r>
-        <w:t xml:space="preserve">, which enters the regression unfiltered; 18 further county-months show ≥20 species yet H &lt; 0.2.</w:t>
+        <w:t xml:space="preserve"> </w:t>
+      </w:r>
+      <w:r>
+        <w:t xml:space="preserve">with four species recorded (adjacent months, 2.2–2.9), a value that arithmetically requires a single species count of at least tens of millions; it enters the regression unfiltered. Eighteen further county-months show ≥20 species yet H &lt; 0.2.</w:t>
       </w:r>
     </w:p>
     <w:p>
@@ -1801,9 +1706,9 @@
       <w:outlineLvl w:val="0"/>
     </w:pPr>
     <w:rPr>
-      <w:rFonts w:asciiTheme="majorHAnsi" w:cstheme="majorBidi" w:eastAsiaTheme="majorEastAsia" w:hAnsiTheme="majorHAnsi"/>
+      <w:rFonts w:asciiTheme="majorHAnsi" w:cstheme="majorBidi" w:eastAsiaTheme="majorEastAsia" w:hAnsiTheme="majorHAnsi" w:ascii="Times New Roman" w:hAnsi="Times New Roman"/>
       <w:color w:themeColor="accent1" w:themeShade="BF" w:val="0F4761"/>
-      <w:sz w:val="40"/>
+      <w:sz w:val="32"/>
       <w:szCs w:val="40"/>
     </w:rPr>
   </w:style>
@@ -1824,9 +1729,9 @@
       <w:outlineLvl w:val="1"/>
     </w:pPr>
     <w:rPr>
-      <w:rFonts w:asciiTheme="majorHAnsi" w:cstheme="majorBidi" w:eastAsiaTheme="majorEastAsia" w:hAnsiTheme="majorHAnsi"/>
+      <w:rFonts w:asciiTheme="majorHAnsi" w:cstheme="majorBidi" w:eastAsiaTheme="majorEastAsia" w:hAnsiTheme="majorHAnsi" w:ascii="Times New Roman" w:hAnsi="Times New Roman"/>
       <w:color w:themeColor="accent1" w:themeShade="BF" w:val="0F4761"/>
-      <w:sz w:val="32"/>
+      <w:sz w:val="28"/>
       <w:szCs w:val="32"/>
     </w:rPr>
   </w:style>
@@ -1847,9 +1752,9 @@
       <w:outlineLvl w:val="2"/>
     </w:pPr>
     <w:rPr>
-      <w:rFonts w:cstheme="majorBidi" w:eastAsiaTheme="majorEastAsia"/>
+      <w:rFonts w:cstheme="majorBidi" w:eastAsiaTheme="majorEastAsia" w:ascii="Times New Roman" w:hAnsi="Times New Roman"/>
       <w:color w:themeColor="accent1" w:themeShade="BF" w:val="0F4761"/>
-      <w:sz w:val="28"/>
+      <w:sz w:val="24"/>
       <w:szCs w:val="28"/>
     </w:rPr>
   </w:style>

</xml_diff>

<commit_message>
Tighten the accumulation-curve claim: mixed gradient plus two diagnostics
The cross-sectional effort-diversity gradient partly reflects real
differences (birders congregate where birds are); the text now states
this and rests the sampling-dominance claim on two discriminating
diagnostics: fixed-community simulations reproduce the gradient from
recording protocol alone, and evenness declines monotonically with
effort, which genuine diversity gradients do not predict. Simulation
methods added to the supplementary materials; Chinese versions and web
cards synced.
</commit_message>
<xml_diff>
--- a/submission/01_Technical_Comment_Science.docx
+++ b/submission/01_Technical_Comment_Science.docx
@@ -174,7 +174,7 @@
         <w:t xml:space="preserve">7</w:t>
       </w:r>
       <w:r>
-        <w:t xml:space="preserve">). The dependent variable here is a Shannon index computed from unstructured birdwatching reports within each county-month. In the estimation sample, 38.8% of county-months rest on a single birdwatcher and the median county is observed in 11 of 120 months (Fig. 1C). Observed richness and Shannon diversity are steep, saturating functions of the number of birdwatchers present (Fig. 1B): county-months with one birder average 15 species (H = 1.90), while those with &gt;100 birders average 142 species (H = 3.60). This is a species-accumulation curve, not a community property. The authors’ own supplementary results carry its signature: PSI associates with lower observed richness but higher evenness (their table S19), the mechanical signature of shorter species lists; in our reproduction, evenness declines monotonically with effort (0.84 at one birder; 0.73 above 100).</w:t>
+        <w:t xml:space="preserve">). The dependent variable here is a Shannon index computed from unstructured birdwatching reports within each county-month. In the estimation sample, 38.8% of county-months rest on a single birdwatcher and the median county is observed in 11 of 120 months (Fig. 1C). Observed richness and Shannon diversity are steep, saturating functions of the number of birdwatchers present (Fig. 1B): county-months with one birder average 15 species (H = 1.90), while those with &gt;100 birders average 142 species (H = 3.60). Part of this gradient surely reflects real differences, because birdwatchers congregate where and when birds are plentiful; two diagnostics nevertheless show that sampling accumulation dominates it. In simulations that hold the community fixed (supplementary materials), checklist-type recording alone reproduces the rise of observed H with effort. And evenness declines monotonically with effort in our reproduction (0.84 at one birder; 0.73 above 100): genuine diversity gradients carry no expectation of ever-declining evenness, whereas lengthening lists add rare species at low counts and depress it mechanically. The authors’ own results carry the same signature: PSI associates with lower observed richness but higher evenness (their table S19), exactly what shorter species lists produce.</w:t>
       </w:r>
     </w:p>
     <w:p>
@@ -1706,9 +1706,9 @@
       <w:outlineLvl w:val="0"/>
     </w:pPr>
     <w:rPr>
-      <w:rFonts w:asciiTheme="majorHAnsi" w:cstheme="majorBidi" w:eastAsiaTheme="majorEastAsia" w:hAnsiTheme="majorHAnsi" w:ascii="Times New Roman" w:hAnsi="Times New Roman"/>
+      <w:rFonts w:asciiTheme="majorHAnsi" w:cstheme="majorBidi" w:eastAsiaTheme="majorEastAsia" w:hAnsiTheme="majorHAnsi"/>
       <w:color w:themeColor="accent1" w:themeShade="BF" w:val="0F4761"/>
-      <w:sz w:val="32"/>
+      <w:sz w:val="40"/>
       <w:szCs w:val="40"/>
     </w:rPr>
   </w:style>
@@ -1729,9 +1729,9 @@
       <w:outlineLvl w:val="1"/>
     </w:pPr>
     <w:rPr>
-      <w:rFonts w:asciiTheme="majorHAnsi" w:cstheme="majorBidi" w:eastAsiaTheme="majorEastAsia" w:hAnsiTheme="majorHAnsi" w:ascii="Times New Roman" w:hAnsi="Times New Roman"/>
+      <w:rFonts w:asciiTheme="majorHAnsi" w:cstheme="majorBidi" w:eastAsiaTheme="majorEastAsia" w:hAnsiTheme="majorHAnsi"/>
       <w:color w:themeColor="accent1" w:themeShade="BF" w:val="0F4761"/>
-      <w:sz w:val="28"/>
+      <w:sz w:val="32"/>
       <w:szCs w:val="32"/>
     </w:rPr>
   </w:style>
@@ -1752,9 +1752,9 @@
       <w:outlineLvl w:val="2"/>
     </w:pPr>
     <w:rPr>
-      <w:rFonts w:cstheme="majorBidi" w:eastAsiaTheme="majorEastAsia" w:ascii="Times New Roman" w:hAnsi="Times New Roman"/>
+      <w:rFonts w:cstheme="majorBidi" w:eastAsiaTheme="majorEastAsia"/>
       <w:color w:themeColor="accent1" w:themeShade="BF" w:val="0F4761"/>
-      <w:sz w:val="24"/>
+      <w:sz w:val="28"/>
       <w:szCs w:val="28"/>
     </w:rPr>
   </w:style>

</xml_diff>